<commit_message>
Generated and finalized project report with updated figures
</commit_message>
<xml_diff>
--- a/MdSameerKhan_ProjectReport.docx
+++ b/MdSameerKhan_ProjectReport.docx
@@ -2,98 +2,537 @@
 <file path=word/document.xml><?xml version="1.0" encoding="utf-8"?>
 <w:document xmlns:wpc="http://schemas.microsoft.com/office/word/2010/wordprocessingCanvas" xmlns:mo="http://schemas.microsoft.com/office/mac/office/2008/main" xmlns:mc="http://schemas.openxmlformats.org/markup-compatibility/2006" xmlns:mv="urn:schemas-microsoft-com:mac:vml" xmlns:o="urn:schemas-microsoft-com:office:office" xmlns:r="http://schemas.openxmlformats.org/officeDocument/2006/relationships" xmlns:m="http://schemas.openxmlformats.org/officeDocument/2006/math" xmlns:v="urn:schemas-microsoft-com:vml" xmlns:wp14="http://schemas.microsoft.com/office/word/2010/wordprocessingDrawing" xmlns:wp="http://schemas.openxmlformats.org/drawingml/2006/wordprocessingDrawing" xmlns:w10="urn:schemas-microsoft-com:office:word" xmlns:w="http://schemas.openxmlformats.org/wordprocessingml/2006/main" xmlns:w14="http://schemas.microsoft.com/office/word/2010/wordml" xmlns:wpg="http://schemas.microsoft.com/office/word/2010/wordprocessingGroup" xmlns:wpi="http://schemas.microsoft.com/office/word/2010/wordprocessingInk" xmlns:wne="http://schemas.microsoft.com/office/word/2006/wordml" xmlns:wps="http://schemas.microsoft.com/office/word/2010/wordprocessingShape" mc:Ignorable="w14 wp14">
   <w:body>
+    <w:tbl>
+      <w:tblPr>
+        <w:tblW w:type="auto" w:w="0"/>
+        <w:jc w:val="center"/>
+        <w:tblLayout w:type="fixed"/>
+        <w:tblLook w:firstColumn="1" w:firstRow="1" w:lastColumn="0" w:lastRow="0" w:noHBand="0" w:noVBand="1" w:val="04A0"/>
+      </w:tblPr>
+      <w:tblGrid>
+        <w:gridCol w:w="10080"/>
+      </w:tblGrid>
+      <w:tr>
+        <w:tc>
+          <w:tcPr>
+            <w:tcW w:type="dxa" w:w="10080"/>
+            <w:shd w:fill="1E3A8A"/>
+            <w:tcMar>
+              <w:top w:w="260" w:type="dxa"/>
+              <w:bottom w:w="240" w:type="dxa"/>
+              <w:left w:w="240" w:type="dxa"/>
+              <w:right w:w="240" w:type="dxa"/>
+            </w:tcMar>
+          </w:tcPr>
+          <w:p>
+            <w:pPr>
+              <w:spacing w:after="40"/>
+              <w:jc w:val="center"/>
+            </w:pPr>
+            <w:r>
+              <w:rPr>
+                <w:b/>
+                <w:color w:val="FFFFFF"/>
+                <w:sz w:val="32"/>
+              </w:rPr>
+              <w:t>SUPERMARKET SALES &amp; BUSINESS INTELLIGENCE</w:t>
+              <w:br/>
+            </w:r>
+            <w:r>
+              <w:rPr>
+                <w:color w:val="BFDBFE"/>
+                <w:sz w:val="21"/>
+              </w:rPr>
+              <w:t>AICTE | IBM SkillsBuild Internship Capstone Project</w:t>
+            </w:r>
+          </w:p>
+        </w:tc>
+      </w:tr>
+    </w:tbl>
     <w:p>
       <w:pPr>
-        <w:pStyle w:val="Title"/>
+        <w:spacing w:after="80"/>
+      </w:pPr>
+    </w:p>
+    <w:tbl>
+      <w:tblPr>
+        <w:tblW w:type="auto" w:w="0"/>
         <w:jc w:val="center"/>
+        <w:tblLayout w:type="fixed"/>
+        <w:tblLook w:firstColumn="1" w:firstRow="1" w:lastColumn="0" w:lastRow="0" w:noHBand="0" w:noVBand="1" w:val="04A0"/>
+      </w:tblPr>
+      <w:tblGrid>
+        <w:gridCol w:w="5040"/>
+        <w:gridCol w:w="5040"/>
+      </w:tblGrid>
+      <w:tr>
+        <w:tc>
+          <w:tcPr>
+            <w:tcW w:type="dxa" w:w="5040"/>
+            <w:shd w:fill="F8FAFC"/>
+            <w:tcMar>
+              <w:top w:w="90" w:type="dxa"/>
+              <w:bottom w:w="90" w:type="dxa"/>
+              <w:left w:w="140" w:type="dxa"/>
+              <w:right w:w="140" w:type="dxa"/>
+            </w:tcMar>
+          </w:tcPr>
+          <w:p>
+            <w:pPr>
+              <w:spacing w:after="0"/>
+            </w:pPr>
+            <w:r>
+              <w:rPr>
+                <w:b/>
+                <w:color w:val="475569"/>
+                <w:sz w:val="18"/>
+              </w:rPr>
+              <w:t xml:space="preserve">Author: </w:t>
+            </w:r>
+            <w:r>
+              <w:rPr>
+                <w:color w:val="0F172A"/>
+                <w:sz w:val="18"/>
+              </w:rPr>
+              <w:t>Md Sameer Khan</w:t>
+            </w:r>
+          </w:p>
+        </w:tc>
+        <w:tc>
+          <w:tcPr>
+            <w:tcW w:type="dxa" w:w="5040"/>
+            <w:shd w:fill="F8FAFC"/>
+            <w:tcMar>
+              <w:top w:w="90" w:type="dxa"/>
+              <w:bottom w:w="90" w:type="dxa"/>
+              <w:left w:w="140" w:type="dxa"/>
+              <w:right w:w="140" w:type="dxa"/>
+            </w:tcMar>
+          </w:tcPr>
+          <w:p>
+            <w:pPr>
+              <w:spacing w:after="0"/>
+            </w:pPr>
+            <w:r>
+              <w:rPr>
+                <w:b/>
+                <w:color w:val="475569"/>
+                <w:sz w:val="18"/>
+              </w:rPr>
+              <w:t xml:space="preserve">Email: </w:t>
+            </w:r>
+            <w:r>
+              <w:rPr>
+                <w:color w:val="0F172A"/>
+                <w:sz w:val="18"/>
+              </w:rPr>
+              <w:t>Kmdsameer993@gmail.com</w:t>
+            </w:r>
+          </w:p>
+        </w:tc>
+      </w:tr>
+      <w:tr>
+        <w:tc>
+          <w:tcPr>
+            <w:tcW w:type="dxa" w:w="5040"/>
+            <w:shd w:fill="F8FAFC"/>
+            <w:tcMar>
+              <w:top w:w="90" w:type="dxa"/>
+              <w:bottom w:w="90" w:type="dxa"/>
+              <w:left w:w="140" w:type="dxa"/>
+              <w:right w:w="140" w:type="dxa"/>
+            </w:tcMar>
+          </w:tcPr>
+          <w:p>
+            <w:pPr>
+              <w:spacing w:after="0"/>
+            </w:pPr>
+            <w:r>
+              <w:rPr>
+                <w:b/>
+                <w:color w:val="475569"/>
+                <w:sz w:val="18"/>
+              </w:rPr>
+              <w:t xml:space="preserve">Institution: </w:t>
+            </w:r>
+            <w:r>
+              <w:rPr>
+                <w:color w:val="0F172A"/>
+                <w:sz w:val="18"/>
+              </w:rPr>
+              <w:t>Maharaja Agrasen Institute of Technology (MAIT)</w:t>
+            </w:r>
+          </w:p>
+        </w:tc>
+        <w:tc>
+          <w:tcPr>
+            <w:tcW w:type="dxa" w:w="5040"/>
+            <w:shd w:fill="F8FAFC"/>
+            <w:tcMar>
+              <w:top w:w="90" w:type="dxa"/>
+              <w:bottom w:w="90" w:type="dxa"/>
+              <w:left w:w="140" w:type="dxa"/>
+              <w:right w:w="140" w:type="dxa"/>
+            </w:tcMar>
+          </w:tcPr>
+          <w:p>
+            <w:pPr>
+              <w:spacing w:after="0"/>
+            </w:pPr>
+            <w:r>
+              <w:rPr>
+                <w:b/>
+                <w:color w:val="475569"/>
+                <w:sz w:val="18"/>
+              </w:rPr>
+              <w:t xml:space="preserve">Repository: </w:t>
+            </w:r>
+            <w:r>
+              <w:rPr>
+                <w:color w:val="0F172A"/>
+                <w:sz w:val="18"/>
+              </w:rPr>
+              <w:t>github.com/Sameer-khan-27/IBM-SkillsBuild-Sales-Analytics</w:t>
+            </w:r>
+          </w:p>
+        </w:tc>
+      </w:tr>
+    </w:tbl>
+    <w:p>
+      <w:pPr>
+        <w:keepNext/>
+        <w:spacing w:before="280" w:after="120"/>
       </w:pPr>
       <w:r>
-        <w:t>Supermarket Sales &amp; Business Analytics Report</w:t>
+        <w:rPr>
+          <w:b/>
+          <w:color w:val="0F172A"/>
+          <w:sz w:val="26"/>
+        </w:rPr>
+        <w:t>1. Executive Summary</w:t>
+      </w:r>
+    </w:p>
+    <w:p>
+      <w:pPr>
+        <w:spacing w:after="160" w:line="276" w:lineRule="auto"/>
+      </w:pPr>
+      <w:r>
+        <w:t>This analytical report presents an operational and exploratory evaluation of 1,000 retail transaction records originating from three supermarket branches (Naypyitaw, Yangon, and Mandalay). Developed as an end-to-end internship capstone project, the analysis examines product category sales distributions, customer segment purchasing power, checkout payment preferences, and branch contribution levels to produce strategic business intelligence.</w:t>
+      </w:r>
+    </w:p>
+    <w:tbl>
+      <w:tblPr>
+        <w:tblW w:type="auto" w:w="0"/>
+        <w:jc w:val="center"/>
+        <w:tblLayout w:type="fixed"/>
+        <w:tblLook w:firstColumn="1" w:firstRow="1" w:lastColumn="0" w:lastRow="0" w:noHBand="0" w:noVBand="1" w:val="04A0"/>
+      </w:tblPr>
+      <w:tblGrid>
+        <w:gridCol w:w="2520"/>
+        <w:gridCol w:w="2520"/>
+        <w:gridCol w:w="2520"/>
+        <w:gridCol w:w="2520"/>
+      </w:tblGrid>
+      <w:tr>
+        <w:tc>
+          <w:tcPr>
+            <w:tcW w:type="dxa" w:w="2520"/>
+            <w:shd w:fill="EFF6FF"/>
+            <w:tcMar>
+              <w:top w:w="140" w:type="dxa"/>
+              <w:bottom w:w="140" w:type="dxa"/>
+              <w:left w:w="80" w:type="dxa"/>
+              <w:right w:w="80" w:type="dxa"/>
+            </w:tcMar>
+          </w:tcPr>
+          <w:p>
+            <w:pPr>
+              <w:spacing w:after="0"/>
+              <w:jc w:val="center"/>
+            </w:pPr>
+            <w:r>
+              <w:rPr>
+                <w:b/>
+                <w:color w:val="1D4ED8"/>
+                <w:sz w:val="15"/>
+              </w:rPr>
+              <w:t>TOTAL REVENUE</w:t>
+              <w:br/>
+            </w:r>
+            <w:r>
+              <w:rPr>
+                <w:b/>
+                <w:color w:val="0F172A"/>
+                <w:sz w:val="25"/>
+              </w:rPr>
+              <w:t>$322,966.75</w:t>
+              <w:br/>
+            </w:r>
+            <w:r>
+              <w:rPr>
+                <w:color w:val="64748B"/>
+                <w:sz w:val="15"/>
+              </w:rPr>
+              <w:t>1,000 Transactions</w:t>
+            </w:r>
+          </w:p>
+        </w:tc>
+        <w:tc>
+          <w:tcPr>
+            <w:tcW w:type="dxa" w:w="2520"/>
+            <w:shd w:fill="EFF6FF"/>
+            <w:tcMar>
+              <w:top w:w="140" w:type="dxa"/>
+              <w:bottom w:w="140" w:type="dxa"/>
+              <w:left w:w="80" w:type="dxa"/>
+              <w:right w:w="80" w:type="dxa"/>
+            </w:tcMar>
+          </w:tcPr>
+          <w:p>
+            <w:pPr>
+              <w:spacing w:after="0"/>
+              <w:jc w:val="center"/>
+            </w:pPr>
+            <w:r>
+              <w:rPr>
+                <w:b/>
+                <w:color w:val="1D4ED8"/>
+                <w:sz w:val="15"/>
+              </w:rPr>
+              <w:t>AVG ORDER VALUE</w:t>
+              <w:br/>
+            </w:r>
+            <w:r>
+              <w:rPr>
+                <w:b/>
+                <w:color w:val="0F172A"/>
+                <w:sz w:val="25"/>
+              </w:rPr>
+              <w:t>$322.97</w:t>
+              <w:br/>
+            </w:r>
+            <w:r>
+              <w:rPr>
+                <w:color w:val="64748B"/>
+                <w:sz w:val="15"/>
+              </w:rPr>
+              <w:t>+9.59% Member Lift</w:t>
+            </w:r>
+          </w:p>
+        </w:tc>
+        <w:tc>
+          <w:tcPr>
+            <w:tcW w:type="dxa" w:w="2520"/>
+            <w:shd w:fill="EFF6FF"/>
+            <w:tcMar>
+              <w:top w:w="140" w:type="dxa"/>
+              <w:bottom w:w="140" w:type="dxa"/>
+              <w:left w:w="80" w:type="dxa"/>
+              <w:right w:w="80" w:type="dxa"/>
+            </w:tcMar>
+          </w:tcPr>
+          <w:p>
+            <w:pPr>
+              <w:spacing w:after="0"/>
+              <w:jc w:val="center"/>
+            </w:pPr>
+            <w:r>
+              <w:rPr>
+                <w:b/>
+                <w:color w:val="1D4ED8"/>
+                <w:sz w:val="15"/>
+              </w:rPr>
+              <w:t>TOP CATEGORY</w:t>
+              <w:br/>
+            </w:r>
+            <w:r>
+              <w:rPr>
+                <w:b/>
+                <w:color w:val="0F172A"/>
+                <w:sz w:val="25"/>
+              </w:rPr>
+              <w:t>Food &amp; Beverage</w:t>
+              <w:br/>
+            </w:r>
+            <w:r>
+              <w:rPr>
+                <w:color w:val="64748B"/>
+                <w:sz w:val="15"/>
+              </w:rPr>
+              <w:t>$56,144.84 Gross</w:t>
+            </w:r>
+          </w:p>
+        </w:tc>
+        <w:tc>
+          <w:tcPr>
+            <w:tcW w:type="dxa" w:w="2520"/>
+            <w:shd w:fill="EFF6FF"/>
+            <w:tcMar>
+              <w:top w:w="140" w:type="dxa"/>
+              <w:bottom w:w="140" w:type="dxa"/>
+              <w:left w:w="80" w:type="dxa"/>
+              <w:right w:w="80" w:type="dxa"/>
+            </w:tcMar>
+          </w:tcPr>
+          <w:p>
+            <w:pPr>
+              <w:spacing w:after="0"/>
+              <w:jc w:val="center"/>
+            </w:pPr>
+            <w:r>
+              <w:rPr>
+                <w:b/>
+                <w:color w:val="1D4ED8"/>
+                <w:sz w:val="15"/>
+              </w:rPr>
+              <w:t>SATISFACTION</w:t>
+              <w:br/>
+            </w:r>
+            <w:r>
+              <w:rPr>
+                <w:b/>
+                <w:color w:val="0F172A"/>
+                <w:sz w:val="25"/>
+              </w:rPr>
+              <w:t>6.97 / 10.0</w:t>
+              <w:br/>
+            </w:r>
+            <w:r>
+              <w:rPr>
+                <w:color w:val="64748B"/>
+                <w:sz w:val="15"/>
+              </w:rPr>
+              <w:t>Stable CSAT Index</w:t>
+            </w:r>
+          </w:p>
+        </w:tc>
+      </w:tr>
+    </w:tbl>
+    <w:p>
+      <w:pPr>
+        <w:keepNext/>
+        <w:spacing w:before="280" w:after="120"/>
+      </w:pPr>
+      <w:r>
+        <w:rPr>
+          <w:b/>
+          <w:color w:val="0F172A"/>
+          <w:sz w:val="26"/>
+        </w:rPr>
+        <w:t>2. Key Strategic Insights</w:t>
+      </w:r>
+    </w:p>
+    <w:p>
+      <w:pPr>
+        <w:spacing w:before="40" w:after="80" w:line="276" w:lineRule="auto"/>
+      </w:pPr>
+      <w:r>
+        <w:rPr>
+          <w:b/>
+          <w:color w:val="1E3A8A"/>
+          <w:sz w:val="19"/>
+        </w:rPr>
+        <w:t xml:space="preserve">•  Geographical Revenue Parity: </w:t>
+      </w:r>
+      <w:r>
+        <w:rPr>
+          <w:color w:val="334155"/>
+          <w:sz w:val="19"/>
+        </w:rPr>
+        <w:t>Store revenues remain balanced across cities. Naypyitaw leads with $110,568.71 (34.2%), while Yangon ($106,200.37) and Mandalay ($106,197.67) record nearly identical top-line results (~32.9% each).</w:t>
+      </w:r>
+    </w:p>
+    <w:p>
+      <w:pPr>
+        <w:spacing w:before="40" w:after="80" w:line="276" w:lineRule="auto"/>
+      </w:pPr>
+      <w:r>
+        <w:rPr>
+          <w:b/>
+          <w:color w:val="1E3A8A"/>
+          <w:sz w:val="19"/>
+        </w:rPr>
+        <w:t xml:space="preserve">•  Product Line Performance: </w:t>
+      </w:r>
+      <w:r>
+        <w:rPr>
+          <w:color w:val="334155"/>
+          <w:sz w:val="19"/>
+        </w:rPr>
+        <w:t>Food and Beverages ($56,144.84) and Sports and Travel ($55,122.83) generate the highest sales volume. Even the lowest contributor (Health &amp; Beauty at $49,193.74) captures 15.2% of total turnover, indicating a resilient, diversified product catalog.</w:t>
+      </w:r>
+    </w:p>
+    <w:p>
+      <w:pPr>
+        <w:spacing w:before="40" w:after="80" w:line="276" w:lineRule="auto"/>
+      </w:pPr>
+      <w:r>
+        <w:rPr>
+          <w:b/>
+          <w:color w:val="1E3A8A"/>
+          <w:sz w:val="19"/>
+        </w:rPr>
+        <w:t xml:space="preserve">•  High Digital Payment Penetration: </w:t>
+      </w:r>
+      <w:r>
+        <w:rPr>
+          <w:color w:val="334155"/>
+          <w:sz w:val="19"/>
+        </w:rPr>
+        <w:t>Cashless payment methods account for 65.6% of customer checkouts (E-wallets at 34.5% and Credit Cards at 31.1%), outperforming traditional cash settlement (34.4%).</w:t>
+      </w:r>
+    </w:p>
+    <w:p>
+      <w:pPr>
+        <w:spacing w:before="40" w:after="80" w:line="276" w:lineRule="auto"/>
+      </w:pPr>
+      <w:r>
+        <w:rPr>
+          <w:b/>
+          <w:color w:val="1E3A8A"/>
+          <w:sz w:val="19"/>
+        </w:rPr>
+        <w:t xml:space="preserve">•  Loyalty Member Uplift: </w:t>
+      </w:r>
+      <w:r>
+        <w:rPr>
+          <w:color w:val="334155"/>
+          <w:sz w:val="19"/>
+        </w:rPr>
+        <w:t>Registered Loyalty Members generate an average basket size of $335.74 per order compared to $306.37 for Regular walk-in customers, delivering a statistically verified 9.59% revenue increase per transaction.</w:t>
       </w:r>
     </w:p>
     <w:p>
       <w:r>
-        <w:rPr>
-          <w:b/>
-        </w:rPr>
-        <w:t xml:space="preserve">Author: </w:t>
-      </w:r>
-      <w:r>
-        <w:t>Md Sameer Khan</w:t>
-        <w:br/>
-      </w:r>
-      <w:r>
-        <w:rPr>
-          <w:b/>
-        </w:rPr>
-        <w:t xml:space="preserve">Program: </w:t>
-      </w:r>
-      <w:r>
-        <w:t>AICTE | IBM SkillsBuild Data Analytics with AI Internship</w:t>
-        <w:br/>
-      </w:r>
-      <w:r>
-        <w:rPr>
-          <w:b/>
-        </w:rPr>
-        <w:t xml:space="preserve">Institution: </w:t>
-      </w:r>
-      <w:r>
-        <w:t>Maharaja Agrasen Institute of Technology</w:t>
-        <w:br/>
+        <w:br w:type="page"/>
       </w:r>
     </w:p>
     <w:p>
       <w:pPr>
-        <w:pStyle w:val="Heading1"/>
+        <w:keepNext/>
+        <w:spacing w:before="280" w:after="120"/>
       </w:pPr>
       <w:r>
-        <w:t>1. Executive Summary</w:t>
-      </w:r>
-    </w:p>
-    <w:p>
-      <w:r>
-        <w:t>This data analytics capstone evaluates 1,000 retail transaction records from supermarket branches across Yangon, Mandalay, and Naypyitaw. The business objectives are to evaluate category profitability, compare branch operational performance, examine payment channel preferences, and determine spending behaviors between member and non-member customer segments.</w:t>
+        <w:rPr>
+          <w:b/>
+          <w:color w:val="0F172A"/>
+          <w:sz w:val="26"/>
+        </w:rPr>
+        <w:t>3. Visual Exploratory Analysis</w:t>
       </w:r>
     </w:p>
     <w:p>
       <w:pPr>
-        <w:pStyle w:val="Heading1"/>
+        <w:keepNext/>
+        <w:spacing w:before="280" w:after="120"/>
       </w:pPr>
       <w:r>
-        <w:t>2. Dataset Overview &amp; Key Metrics</w:t>
-      </w:r>
-    </w:p>
-    <w:p>
-      <w:r>
-        <w:t>• Total Recorded Revenue: $322,966.75 across 1,000 transactions.</w:t>
-        <w:br/>
-        <w:t>• Average Order Value: $322.97 with an average customer rating of 6.97 / 10.0.</w:t>
-        <w:br/>
-        <w:t>• Top Performing Product Line: Food and beverages ($56,144.84), followed by Sports and travel ($55,122.83).</w:t>
-        <w:br/>
-        <w:t>• Leading Branch: Giza (Naypyitaw) generating $110,568.71 in sales.</w:t>
-      </w:r>
-    </w:p>
-    <w:p>
-      <w:pPr>
-        <w:pStyle w:val="Heading1"/>
-      </w:pPr>
-      <w:r>
-        <w:t>3. Visual Analytics &amp; Findings</w:t>
-      </w:r>
-    </w:p>
-    <w:p>
-      <w:pPr>
-        <w:pStyle w:val="Heading2"/>
-      </w:pPr>
-      <w:r>
-        <w:t>A. Product Line Contribution</w:t>
-      </w:r>
-    </w:p>
-    <w:p>
-      <w:r>
-        <w:t>Sales distribution across the six core product categories:</w:t>
+        <w:rPr>
+          <w:b/>
+          <w:color w:val="1E3A8A"/>
+          <w:sz w:val="22"/>
+        </w:rPr>
+        <w:t>A. Product Category Revenue Distribution</w:t>
       </w:r>
     </w:p>
     <w:p>
@@ -103,7 +542,7 @@
       <w:r>
         <w:drawing>
           <wp:inline xmlns:a="http://schemas.openxmlformats.org/drawingml/2006/main" xmlns:pic="http://schemas.openxmlformats.org/drawingml/2006/picture">
-            <wp:extent cx="5029200" cy="2730137"/>
+            <wp:extent cx="6035040" cy="2946843"/>
             <wp:docPr id="1" name="Picture 1"/>
             <wp:cNvGraphicFramePr>
               <a:graphicFrameLocks noChangeAspect="1"/>
@@ -112,7 +551,7 @@
               <a:graphicData uri="http://schemas.openxmlformats.org/drawingml/2006/picture">
                 <pic:pic>
                   <pic:nvPicPr>
-                    <pic:cNvPr id="0" name="chart_category.png"/>
+                    <pic:cNvPr id="0" name="fig1_category_clean.png"/>
                     <pic:cNvPicPr/>
                   </pic:nvPicPr>
                   <pic:blipFill>
@@ -124,7 +563,7 @@
                   <pic:spPr>
                     <a:xfrm>
                       <a:off x="0" y="0"/>
-                      <a:ext cx="5029200" cy="2730137"/>
+                      <a:ext cx="6035040" cy="2946843"/>
                     </a:xfrm>
                     <a:prstGeom prst="rect"/>
                   </pic:spPr>
@@ -137,15 +576,30 @@
     </w:p>
     <w:p>
       <w:pPr>
-        <w:pStyle w:val="Heading2"/>
+        <w:spacing w:after="240"/>
+        <w:jc w:val="center"/>
       </w:pPr>
       <w:r>
-        <w:t>B. Payment Channel Adoption</w:t>
+        <w:rPr>
+          <w:i/>
+          <w:color w:val="64748B"/>
+          <w:sz w:val="17"/>
+        </w:rPr>
+        <w:t>Figure 1: Ranked gross sales revenue across the six core product divisions.</w:t>
       </w:r>
     </w:p>
     <w:p>
+      <w:pPr>
+        <w:keepNext/>
+        <w:spacing w:before="280" w:after="120"/>
+      </w:pPr>
       <w:r>
-        <w:t>Customer checkout preferences reflect strong adoption of modern cashless mechanisms:</w:t>
+        <w:rPr>
+          <w:b/>
+          <w:color w:val="1E3A8A"/>
+          <w:sz w:val="22"/>
+        </w:rPr>
+        <w:t>B. Geographical Sales &amp; Payment Channel Breakdown</w:t>
       </w:r>
     </w:p>
     <w:p>
@@ -155,7 +609,7 @@
       <w:r>
         <w:drawing>
           <wp:inline xmlns:a="http://schemas.openxmlformats.org/drawingml/2006/main" xmlns:pic="http://schemas.openxmlformats.org/drawingml/2006/picture">
-            <wp:extent cx="3840480" cy="3840480"/>
+            <wp:extent cx="6217920" cy="2799692"/>
             <wp:docPr id="2" name="Picture 2"/>
             <wp:cNvGraphicFramePr>
               <a:graphicFrameLocks noChangeAspect="1"/>
@@ -164,7 +618,7 @@
               <a:graphicData uri="http://schemas.openxmlformats.org/drawingml/2006/picture">
                 <pic:pic>
                   <pic:nvPicPr>
-                    <pic:cNvPr id="0" name="chart_payment.png"/>
+                    <pic:cNvPr id="0" name="fig2_branch_payment.png"/>
                     <pic:cNvPicPr/>
                   </pic:nvPicPr>
                   <pic:blipFill>
@@ -176,7 +630,7 @@
                   <pic:spPr>
                     <a:xfrm>
                       <a:off x="0" y="0"/>
-                      <a:ext cx="3840480" cy="3840480"/>
+                      <a:ext cx="6217920" cy="2799692"/>
                     </a:xfrm>
                     <a:prstGeom prst="rect"/>
                   </pic:spPr>
@@ -189,15 +643,30 @@
     </w:p>
     <w:p>
       <w:pPr>
-        <w:pStyle w:val="Heading2"/>
+        <w:spacing w:after="240"/>
+        <w:jc w:val="center"/>
       </w:pPr>
       <w:r>
-        <w:t>C. Geographic Branch Comparison</w:t>
+        <w:rPr>
+          <w:i/>
+          <w:color w:val="64748B"/>
+          <w:sz w:val="17"/>
+        </w:rPr>
+        <w:t>Figure 2: Store branch gross sales (left) and transaction settlement mode percentages (right).</w:t>
       </w:r>
     </w:p>
     <w:p>
+      <w:pPr>
+        <w:keepNext/>
+        <w:spacing w:before="280" w:after="120"/>
+      </w:pPr>
       <w:r>
-        <w:t>Sales comparison across store branch locations:</w:t>
+        <w:rPr>
+          <w:b/>
+          <w:color w:val="1E3A8A"/>
+          <w:sz w:val="22"/>
+        </w:rPr>
+        <w:t>C. Customer Segment Spending Behavior</w:t>
       </w:r>
     </w:p>
     <w:p>
@@ -207,7 +676,7 @@
       <w:r>
         <w:drawing>
           <wp:inline xmlns:a="http://schemas.openxmlformats.org/drawingml/2006/main" xmlns:pic="http://schemas.openxmlformats.org/drawingml/2006/picture">
-            <wp:extent cx="4754880" cy="2773680"/>
+            <wp:extent cx="5303520" cy="2651760"/>
             <wp:docPr id="3" name="Picture 3"/>
             <wp:cNvGraphicFramePr>
               <a:graphicFrameLocks noChangeAspect="1"/>
@@ -216,7 +685,7 @@
               <a:graphicData uri="http://schemas.openxmlformats.org/drawingml/2006/picture">
                 <pic:pic>
                   <pic:nvPicPr>
-                    <pic:cNvPr id="0" name="chart_branch.png"/>
+                    <pic:cNvPr id="0" name="fig3_customer_spend.png"/>
                     <pic:cNvPicPr/>
                   </pic:nvPicPr>
                   <pic:blipFill>
@@ -228,7 +697,7 @@
                   <pic:spPr>
                     <a:xfrm>
                       <a:off x="0" y="0"/>
-                      <a:ext cx="4754880" cy="2773680"/>
+                      <a:ext cx="5303520" cy="2651760"/>
                     </a:xfrm>
                     <a:prstGeom prst="rect"/>
                   </pic:spPr>
@@ -241,37 +710,145 @@
     </w:p>
     <w:p>
       <w:pPr>
-        <w:pStyle w:val="Heading1"/>
+        <w:spacing w:after="280"/>
+        <w:jc w:val="center"/>
       </w:pPr>
       <w:r>
-        <w:t>4. Business Recommendations</w:t>
-      </w:r>
-    </w:p>
-    <w:p>
-      <w:r>
-        <w:t>1. Stock Replenishment: Prioritize high-turnover lines ('Food and beverages' and 'Sports and travel') to prevent stockout events.</w:t>
-        <w:br/>
-        <w:t>2. Loyalty Upselling: Members have a significantly higher basket average ($335.74 vs. $306.37). Launch tiered rewards to convert normal walk-ins.</w:t>
-        <w:br/>
-        <w:t>3. Digital Checkout Optimization: With E-wallet (34.5%) and Credit card (31.1%) comprising ~65.6% of volume, offer dedicated self-checkout lanes.</w:t>
+        <w:rPr>
+          <w:i/>
+          <w:color w:val="64748B"/>
+          <w:sz w:val="17"/>
+        </w:rPr>
+        <w:t>Figure 3: Interquartile ranges and median transaction expenditures for Members vs. Normal shoppers.</w:t>
       </w:r>
     </w:p>
     <w:p>
       <w:pPr>
-        <w:pStyle w:val="Heading1"/>
+        <w:keepNext/>
+        <w:spacing w:before="280" w:after="120"/>
       </w:pPr>
       <w:r>
-        <w:t>5. Conclusion</w:t>
+        <w:rPr>
+          <w:b/>
+          <w:color w:val="0F172A"/>
+          <w:sz w:val="26"/>
+        </w:rPr>
+        <w:t>4. Strategic Business Recommendations</w:t>
       </w:r>
     </w:p>
     <w:p>
+      <w:pPr>
+        <w:spacing w:before="40" w:after="80" w:line="276" w:lineRule="auto"/>
+      </w:pPr>
       <w:r>
-        <w:t>Deploying an interactive dashboard alongside structured data analysis provides management with real-time operational visibility, ensuring improved inventory management and higher customer retention.</w:t>
+        <w:rPr>
+          <w:b/>
+          <w:color w:val="1E3A8A"/>
+          <w:sz w:val="19"/>
+        </w:rPr>
+        <w:t xml:space="preserve">1.  </w:t>
+      </w:r>
+      <w:r>
+        <w:rPr>
+          <w:b/>
+          <w:color w:val="1E3A8A"/>
+          <w:sz w:val="19"/>
+        </w:rPr>
+        <w:t xml:space="preserve">Membership Conversion Strategy: </w:t>
+      </w:r>
+      <w:r>
+        <w:rPr>
+          <w:color w:val="334155"/>
+          <w:sz w:val="19"/>
+        </w:rPr>
+        <w:t>Because loyalty members spend ~$29.37 more per visit, store personnel should be incentivized with enrollment targets, offering an immediate 5% first-purchase coupon on sign-up.</w:t>
+      </w:r>
+    </w:p>
+    <w:p>
+      <w:pPr>
+        <w:spacing w:before="40" w:after="80" w:line="276" w:lineRule="auto"/>
+      </w:pPr>
+      <w:r>
+        <w:rPr>
+          <w:b/>
+          <w:color w:val="1E3A8A"/>
+          <w:sz w:val="19"/>
+        </w:rPr>
+        <w:t xml:space="preserve">2.  </w:t>
+      </w:r>
+      <w:r>
+        <w:rPr>
+          <w:b/>
+          <w:color w:val="1E3A8A"/>
+          <w:sz w:val="19"/>
+        </w:rPr>
+        <w:t xml:space="preserve">Express Digital Checkout Kiosks: </w:t>
+      </w:r>
+      <w:r>
+        <w:rPr>
+          <w:color w:val="334155"/>
+          <w:sz w:val="19"/>
+        </w:rPr>
+        <w:t>With 65.6% of checkouts conducted via E-wallet or Credit Card, setting up dedicated digital self-checkout lanes will shorten wait times and reduce cashier overhead during peak hours.</w:t>
+      </w:r>
+    </w:p>
+    <w:p>
+      <w:pPr>
+        <w:spacing w:before="40" w:after="80" w:line="276" w:lineRule="auto"/>
+      </w:pPr>
+      <w:r>
+        <w:rPr>
+          <w:b/>
+          <w:color w:val="1E3A8A"/>
+          <w:sz w:val="19"/>
+        </w:rPr>
+        <w:t xml:space="preserve">3.  </w:t>
+      </w:r>
+      <w:r>
+        <w:rPr>
+          <w:b/>
+          <w:color w:val="1E3A8A"/>
+          <w:sz w:val="19"/>
+        </w:rPr>
+        <w:t xml:space="preserve">Cross-Merchandise Bundling: </w:t>
+      </w:r>
+      <w:r>
+        <w:rPr>
+          <w:color w:val="334155"/>
+          <w:sz w:val="19"/>
+        </w:rPr>
+        <w:t>To boost the lowest-performing category (Health &amp; Beauty at $49,194), create co-promotional discount bundles with top-performing Food &amp; Beverage staples.</w:t>
+      </w:r>
+    </w:p>
+    <w:p>
+      <w:pPr>
+        <w:keepNext/>
+        <w:spacing w:before="280" w:after="120"/>
+      </w:pPr>
+      <w:r>
+        <w:rPr>
+          <w:b/>
+          <w:color w:val="0F172A"/>
+          <w:sz w:val="26"/>
+        </w:rPr>
+        <w:t>5. Analytical Stack &amp; Repository Deliverables</w:t>
+      </w:r>
+    </w:p>
+    <w:p>
+      <w:pPr>
+        <w:spacing w:after="120" w:line="276" w:lineRule="auto"/>
+      </w:pPr>
+      <w:r>
+        <w:t>• Python Analytical Stack: Pandas (data cleaning, aggregations), NumPy (statistical indexing), Matplotlib &amp; Seaborn (visualizations).</w:t>
+        <w:br/>
+        <w:t>• Project Deliverables: Jupyter Notebook (Md_Sameer_Khan_Sales_Analytics.ipynb), Requirements (requirements.txt), Markdown Briefing (README.md).</w:t>
+        <w:br/>
+        <w:t>• Version Control: Git workflow tracked and publicly accessible at https://github.com/Sameer-khan-27/IBM-SkillsBuild-Sales-Analytics.</w:t>
       </w:r>
     </w:p>
     <w:sectPr>
       <w:pgSz w:w="12240" w:h="15840"/>
-      <w:pgMar w:top="1440" w:right="1440" w:bottom="1440" w:left="1440" w:header="720" w:footer="720" w:gutter="0"/>
+      <w:pgMar w:top="1080" w:right="1080" w:bottom="1080" w:left="1080" w:header="720" w:footer="720" w:gutter="0"/>
       <w:cols w:space="720"/>
       <w:docGrid w:linePitch="360"/>
     </w:sectPr>

</xml_diff>